<commit_message>
Update Week 3 report formatting and regenerate DOCX
</commit_message>
<xml_diff>
--- a/report/YuvaIntern_Week3_Report.docx
+++ b/report/YuvaIntern_Week3_Report.docx
@@ -3237,6 +3237,11 @@
       </w:r>
     </w:p>
     <w:p>
+      <w:r>
+        <w:br w:type="page"/>
+      </w:r>
+    </w:p>
+    <w:p>
       <w:pPr>
         <w:pStyle w:val="Heading2"/>
       </w:pPr>

</xml_diff>